<commit_message>
Record Auth recovery slice GitHub delivery
</commit_message>
<xml_diff>
--- a/docs/reports/2026-10-15-auth-recovery.docx
+++ b/docs/reports/2026-10-15-auth-recovery.docx
@@ -644,8 +644,71 @@
       </w:r>
     </w:p>
     <w:p>
+      <w:pPr>
+        <w:pStyle w:val="Heading1"/>
+      </w:pPr>
       <w:r>
-        <w:t>The next backend slice is the eight-role authorization matrix and trusted role storage/capability mapping. This slice did not complete AUTH-01/AUTH-02/AUTHZ-01, the Phase 1 closure checklist, Vercel workflow gates or human acceptance. No phase completion, production URL verification or GitHub push is claimed by this report.</w:t>
+        <w:t>GitHub and deployment status</w:t>
+      </w:r>
+    </w:p>
+    <w:p>
+      <w:r>
+        <w:t>Review branch [</w:t>
+      </w:r>
+      <w:r>
+        <w:rPr>
+          <w:rFonts w:ascii="Consolas" w:hAnsi="Consolas"/>
+          <w:sz w:val="20"/>
+        </w:rPr>
+        <w:t>codex/phase-1-auth-recovery</w:t>
+      </w:r>
+      <w:r>
+        <w:t xml:space="preserve">](https://github.com/URUUDEV/Virtual-Ink/tree/codex/phase-1-auth-recovery) is pushed to </w:t>
+      </w:r>
+      <w:r>
+        <w:rPr>
+          <w:rFonts w:ascii="Consolas" w:hAnsi="Consolas"/>
+          <w:sz w:val="20"/>
+        </w:rPr>
+        <w:t>origin</w:t>
+      </w:r>
+      <w:r>
+        <w:t xml:space="preserve"> at commit </w:t>
+      </w:r>
+      <w:r>
+        <w:rPr>
+          <w:rFonts w:ascii="Consolas" w:hAnsi="Consolas"/>
+          <w:sz w:val="20"/>
+        </w:rPr>
+        <w:t>6e141a6</w:t>
+      </w:r>
+      <w:r>
+        <w:t xml:space="preserve">. The existing user-owned </w:t>
+      </w:r>
+      <w:r>
+        <w:rPr>
+          <w:rFonts w:ascii="Consolas" w:hAnsi="Consolas"/>
+          <w:sz w:val="20"/>
+        </w:rPr>
+        <w:t>apps/web/next-env.d.ts</w:t>
+      </w:r>
+      <w:r>
+        <w:t xml:space="preserve"> edit was left unstaged. A review branch push does not merge to </w:t>
+      </w:r>
+      <w:r>
+        <w:rPr>
+          <w:rFonts w:ascii="Consolas" w:hAnsi="Consolas"/>
+          <w:sz w:val="20"/>
+        </w:rPr>
+        <w:t>main</w:t>
+      </w:r>
+      <w:r>
+        <w:t xml:space="preserve"> or close Phase 1. No Preview deployment for this commit or authenticated Production recovery has yet been verified.</w:t>
+      </w:r>
+    </w:p>
+    <w:p>
+      <w:r>
+        <w:t>The next backend slice is the eight-role authorization matrix and trusted role storage/capability mapping. This slice did not complete AUTH-01/AUTH-02/AUTHZ-01, the Phase 1 closure checklist, Vercel workflow gates or human acceptance. No phase completion or Production URL verification is claimed by this report.</w:t>
       </w:r>
     </w:p>
     <w:p>

</xml_diff>

<commit_message>
Record password recovery Preview verification
</commit_message>
<xml_diff>
--- a/docs/reports/2026-10-15-auth-recovery.docx
+++ b/docs/reports/2026-10-15-auth-recovery.docx
@@ -396,6 +396,59 @@
               <w:pStyle w:val="ReportTableText"/>
             </w:pPr>
             <w:r>
+              <w:t>Vercel Preview</w:t>
+            </w:r>
+          </w:p>
+        </w:tc>
+        <w:tc>
+          <w:tcPr>
+            <w:tcW w:type="dxa" w:w="6060"/>
+            <w:vAlign w:val="center"/>
+          </w:tcPr>
+          <w:p>
+            <w:pPr>
+              <w:pStyle w:val="ReportTableText"/>
+            </w:pPr>
+            <w:r>
+              <w:t xml:space="preserve">Ready deployment </w:t>
+            </w:r>
+            <w:r>
+              <w:rPr>
+                <w:rFonts w:ascii="Consolas" w:hAnsi="Consolas"/>
+                <w:sz w:val="20"/>
+              </w:rPr>
+              <w:t>FL46saDJnCuvFqj44pPLLiVUkvfg</w:t>
+            </w:r>
+            <w:r>
+              <w:t xml:space="preserve">, commit </w:t>
+            </w:r>
+            <w:r>
+              <w:rPr>
+                <w:rFonts w:ascii="Consolas" w:hAnsi="Consolas"/>
+                <w:sz w:val="20"/>
+              </w:rPr>
+              <w:t>07af4b1</w:t>
+            </w:r>
+            <w:r>
+              <w:t>; deployed forgot-password screen and guest reset-page redirect checked in Chrome; no browser errors captured</w:t>
+            </w:r>
+          </w:p>
+        </w:tc>
+      </w:tr>
+      <w:tr>
+        <w:trPr>
+          <w:cantSplit/>
+        </w:trPr>
+        <w:tc>
+          <w:tcPr>
+            <w:tcW w:type="dxa" w:w="3300"/>
+            <w:vAlign w:val="center"/>
+          </w:tcPr>
+          <w:p>
+            <w:pPr>
+              <w:pStyle w:val="ReportTableText"/>
+            </w:pPr>
+            <w:r>
               <w:t>Repository security heuristic</w:t>
             </w:r>
           </w:p>
@@ -501,7 +554,7 @@
     </w:p>
     <w:p>
       <w:r>
-        <w:t xml:space="preserve">Synthetic provider checks do not establish email delivery, expiry/one-time use configuration, genuine account restoration or password reset in hosted Supabase. The actual customer test mailbox remains unapproved; no account was created. Preview/Production recovery was not tested. Protected Preview keeps its access protection. No database migration or privileged credential was added. Fresh loopback HTTP checks returned 200 for </w:t>
+        <w:t xml:space="preserve">Synthetic provider checks do not establish email delivery, expiry/one-time use configuration, genuine account restoration or password reset in hosted Supabase. The actual customer test mailbox remains unapproved; no account was created. The deployed Preview verifies only the Auth-off page state and anonymous redirect; Production recovery, real authenticated Preview recovery, and every other role workflow remain untested. Preview protection remains enabled. No database migration or privileged credential was added. Fresh loopback HTTP checks returned 200 for </w:t>
       </w:r>
       <w:r>
         <w:rPr>
@@ -673,17 +726,27 @@
         <w:t>origin</w:t>
       </w:r>
       <w:r>
-        <w:t xml:space="preserve"> at commit </w:t>
+        <w:t xml:space="preserve"> through report commit </w:t>
       </w:r>
       <w:r>
         <w:rPr>
           <w:rFonts w:ascii="Consolas" w:hAnsi="Consolas"/>
           <w:sz w:val="20"/>
         </w:rPr>
-        <w:t>6e141a6</w:t>
+        <w:t>07af4b1</w:t>
       </w:r>
       <w:r>
-        <w:t xml:space="preserve">. The existing user-owned </w:t>
+        <w:t xml:space="preserve">. Vercel Preview URL: [branch alias](https://virtual-ink-git-codex-phase-1-auth-recovery-shadowrootsec-5679.vercel.app) and [tested deployment URL](https://virtual-mbe2i0pjp-shadowrootsec-5679.vercel.app), deployment ID </w:t>
+      </w:r>
+      <w:r>
+        <w:rPr>
+          <w:rFonts w:ascii="Consolas" w:hAnsi="Consolas"/>
+          <w:sz w:val="20"/>
+        </w:rPr>
+        <w:t>FL46saDJnCuvFqj44pPLLiVUkvfg</w:t>
+      </w:r>
+      <w:r>
+        <w:t xml:space="preserve">, status Ready. Checks were made at 14:15 UTC on 15 October 2026. The existing user-owned </w:t>
       </w:r>
       <w:r>
         <w:rPr>
@@ -703,7 +766,7 @@
         <w:t>main</w:t>
       </w:r>
       <w:r>
-        <w:t xml:space="preserve"> or close Phase 1. No Preview deployment for this commit or authenticated Production recovery has yet been verified.</w:t>
+        <w:t xml:space="preserve"> or close Phase 1. No Preview deployment for this commit or authenticated Preview password-reset journey was tested; authenticated Production recovery remains unverified. Only the public form state and anonymous reset-page redirect were checked on the deployed Preview.</w:t>
       </w:r>
     </w:p>
     <w:p>

</xml_diff>